<commit_message>
Clarify Sprint 2 manual review status
Co-authored-by: Copilot <223556219+Copilot@users.noreply.github.com>
</commit_message>
<xml_diff>
--- a/report/generated-report/final.docx
+++ b/report/generated-report/final.docx
@@ -111,7 +111,7 @@
         <w:rPr>
           <w:lang w:val="en-US"/>
         </w:rPr>
-        <w:t xml:space="preserve">The saved exploratory run contains 1,151 artifacts from 30 provisional families and 3,997 directed comparisons. The assessor reports at least one supported indicator in 588 comparisons (14.7%); 206 comparisons have incomplete evidence coverage. Local script execution, network expansion, and credential-related changes are the most frequently reported categories. Additional graph edges account for most comparisons, and repeated artifacts make observations dependent. The selected families are not a representative sample of GitSkills. Independent review and adjudication for this run remain pending, so these counts measure automated findings rather than validated security incidents or scanner accuracy. The study provides evidence of candidate security-sensitive changes and an auditable way to examine them, while leaving their validated frequency and historical lineage unresolved.</w:t>
+        <w:t xml:space="preserve">The saved exploratory run contains 1,151 artifacts from 30 provisional families and 3,997 directed comparisons. The assessor reports at least one supported indicator in 588 comparisons (14.7%); 206 comparisons have incomplete evidence coverage. Local script execution, network expansion, and credential-related changes are the most frequently reported categories. Additional graph edges account for most comparisons, and repeated artifacts make observations dependent. The selected families are not a representative sample of GitSkills. Review annotation files now contain draft entries for 21 of 30 directed cases and all 15 relationship cases, but all entries remain pending human acceptance and adjudication. The automated counts therefore are not validated security incidents or scanner-accuracy estimates. The study provides evidence of candidate security-sensitive changes and an auditable way to examine them, while leaving their validated frequency and historical lineage unresolved.</w:t>
       </w:r>
     </w:p>
     <w:p>
@@ -2655,7 +2655,51 @@
         <w:rPr>
           <w:lang w:val="en-US"/>
         </w:rPr>
-        <w:t xml:space="preserve">The pipeline completed the automated workflow for the supplied cohort, loaded all 1,151 selected artifacts, preserved pair-level outcomes, and generated review samples. Completion establishes that those stages produced the saved outputs. It does not establish that relationships are historical facts, that every supported RI is correct, or that unflagged cases lack in-scope changes. The execution summary explicitly states that independent review and adjudication are awaited.</w:t>
+        <w:t xml:space="preserve">The pipeline completed the automated workflow for the supplied cohort, loaded all 1,151 selected artifacts, preserved pair-level outcomes, and generated review samples. Completion establishes that those stages produced the saved outputs. It does not establish that relationships are historical facts, that every supported RI is correct, or that unflagged cases lack in-scope changes. The committed annotation files contain draft entries for 21 of the 30 directed cases and all 15 relationship cases. Their entries are marked</w:t>
+      </w:r>
+      <w:r>
+        <w:rPr>
+          <w:lang w:val="en-US"/>
+        </w:rPr>
+        <w:t xml:space="preserve"> </w:t>
+      </w:r>
+      <w:r>
+        <w:rPr>
+          <w:rStyle w:val="VerbatimChar"/>
+          <w:lang w:val="en-US"/>
+        </w:rPr>
+        <w:t xml:space="preserve">review_phase=independent</w:t>
+      </w:r>
+      <w:r>
+        <w:rPr>
+          <w:lang w:val="en-US"/>
+        </w:rPr>
+        <w:t xml:space="preserve"> </w:t>
+      </w:r>
+      <w:r>
+        <w:rPr>
+          <w:lang w:val="en-US"/>
+        </w:rPr>
+        <w:t xml:space="preserve">but</w:t>
+      </w:r>
+      <w:r>
+        <w:rPr>
+          <w:lang w:val="en-US"/>
+        </w:rPr>
+        <w:t xml:space="preserve"> </w:t>
+      </w:r>
+      <w:r>
+        <w:rPr>
+          <w:rStyle w:val="VerbatimChar"/>
+          <w:lang w:val="en-US"/>
+        </w:rPr>
+        <w:t xml:space="preserve">review_status=pending</w:t>
+      </w:r>
+      <w:r>
+        <w:rPr>
+          <w:lang w:val="en-US"/>
+        </w:rPr>
+        <w:t xml:space="preserve">; the notes identify AI-assisted proposals awaiting human acceptance. This records review work in progress, not completed independent or adjudicated labels.</w:t>
       </w:r>
     </w:p>
     <w:p>
@@ -3036,7 +3080,7 @@
         <w:rPr>
           <w:lang w:val="en-US"/>
         </w:rPr>
-        <w:t xml:space="preserve">Independent adjudication for the current sample is pending, so accuracy and agreement are unknown. AI-assisted draft judgments do not supply an independent human reference standard. Numeric IDs are local to a prepared database build; stable source identity, content hashes, policy, code revision, and sample checksums are needed to reconnect labels to a run. The manifest records fingerprints but the prepared database size alone is not a cryptographic identity check. A regenerated cohort or changed implementation requires checking compatibility before reusing annotations.</w:t>
+        <w:t xml:space="preserve">Draft annotations have been committed for 21 of 30 directed cases and all 15 relationship cases, but every row remains pending and the notes identify AI-assisted proposals awaiting human acceptance. Independent adjudication has not occurred, so the entries do not yet provide an accepted human reference standard and accuracy and agreement remain unknown. Numeric IDs are local to a prepared database build; stable source identity, content hashes, policy, code revision, and sample checksums are needed to reconnect labels to a run. The manifest records fingerprints but the prepared database size alone is not a cryptographic identity check. A regenerated cohort or changed implementation requires checking compatibility before reusing annotations.</w:t>
       </w:r>
     </w:p>
     <w:p>
@@ -3082,7 +3126,7 @@
         <w:rPr>
           <w:lang w:val="en-US"/>
         </w:rPr>
-        <w:t xml:space="preserve">These findings establish a set of candidate changes for review, not 588 confirmed incidents or a population-wide risk rate. Independent adjudication remains pending, coverage is incomplete for some comparisons, and many directions rely on structural rather than temporal evidence. The research question therefore has a qualified empirical answer: observable candidate introductions occur in the analyzed outputs, while their validated frequency and historical interpretation require further evidence.</w:t>
+        <w:t xml:space="preserve">These findings establish a set of candidate changes for review, not 588 confirmed incidents or a population-wide risk rate. Draft annotations have been recorded for part of the directed review sample and all relationship cases, but human acceptance and independent adjudication remain pending. Coverage is incomplete for some comparisons, and many directions rely on structural rather than temporal evidence. The research question therefore has a qualified empirical answer: observable candidate introductions occur in the analyzed outputs, while their validated frequency and historical interpretation require further evidence.</w:t>
       </w:r>
     </w:p>
     <w:p>
@@ -6063,7 +6107,26 @@
         <w:rPr>
           <w:lang w:val="en-US"/>
         </w:rPr>
-        <w:t xml:space="preserve">The current saved summary contains no completed independent validation metrics. Precision, recall, and agreement therefore remain unreported. Detailed annotation instructions and field definitions are retained in the repository resources listed in Appendix E rather than reproduced here.</w:t>
+        <w:t xml:space="preserve">The annotation files contain draft entries for 21 of 30 directed cases and all 15 relationship cases. Every row remains</w:t>
+      </w:r>
+      <w:r>
+        <w:rPr>
+          <w:lang w:val="en-US"/>
+        </w:rPr>
+        <w:t xml:space="preserve"> </w:t>
+      </w:r>
+      <w:r>
+        <w:rPr>
+          <w:rStyle w:val="VerbatimChar"/>
+          <w:lang w:val="en-US"/>
+        </w:rPr>
+        <w:t xml:space="preserve">pending</w:t>
+      </w:r>
+      <w:r>
+        <w:rPr>
+          <w:lang w:val="en-US"/>
+        </w:rPr>
+        <w:t xml:space="preserve">, and the notes identify AI-assisted proposals awaiting human acceptance; the entries are not completed or adjudicated labels. The current saved summary contains no completed independent validation metrics, so precision, recall, and agreement remain unreported. Detailed annotation instructions and field definitions are retained in the repository resources listed in Appendix E rather than reproduced here.</w:t>
       </w:r>
     </w:p>
     <w:p>

</xml_diff>